<commit_message>
fix(rbpp-pipeline): corrige la veille HAS du 21/09 et durcit le prompt — dates de publication depuis les pages HAS (PPA-DUI 24/06/2026, vie intime 12/02/2025 màj 14/11/2025), dates héritées avec leur édition, projection retirée, titres exacts, flux RSS lié ; étape 7.6 bis à cinq motifs (validée dans les deux sens)
Co-Authored-By: Claude Opus 5 <noreply@anthropic.com>
</commit_message>
<xml_diff>
--- a/sources/veille/2026-09-21_veille_has-actualite.docx
+++ b/sources/veille/2026-09-21_veille_has-actualite.docx
@@ -83,7 +83,39 @@
           <w:sz w:val="22"/>
           <w:szCs w:val="22"/>
         </w:rPr>
-        <w:t xml:space="preserve">• Aucune nouvelle RBPP publiée dans le secteur social et médico-social entre le 14 et le 21 septembre 2026.</w:t>
+        <w:t xml:space="preserve">• Aucune nouvelle RBPP publiée dans le secteur social et médico-social entre le 14 et le 21 septembre 2026 — flux RSS « Recommandations et guides » de la HAS lu le 21/09/2026 : aucune entrée du secteur datée de la fenêtre (</w:t>
+      </w:r>
+      <w:hyperlink w:history="1" r:id="rIdC21rss">
+        <w:r>
+          <w:rPr>
+            <w:rFonts w:ascii="Calibri" w:cs="Calibri" w:eastAsia="Calibri" w:hAnsi="Calibri"/>
+            <w:color w:val="1155CC"/>
+            <w:sz w:val="22"/>
+            <w:szCs w:val="22"/>
+            <w:u w:val="single"/>
+          </w:rPr>
+          <w:t xml:space="preserve">has-sante.fr/feed/Rss2.jsp?id=p_3081452</w:t>
+        </w:r>
+      </w:hyperlink>
+      <w:r>
+        <w:rPr>
+          <w:rFonts w:ascii="Calibri" w:cs="Calibri" w:eastAsia="Calibri" w:hAnsi="Calibri"/>
+          <w:color w:val="1F2937"/>
+          <w:sz w:val="22"/>
+          <w:szCs w:val="22"/>
+        </w:rPr>
+        <w:t xml:space="preserve">). </w:t>
+      </w:r>
+      <w:r>
+        <w:rPr>
+          <w:rFonts w:ascii="Calibri" w:cs="Calibri" w:eastAsia="Calibri" w:hAnsi="Calibri"/>
+          <w:i/>
+          <w:iCs/>
+          <w:color w:val="6B7280"/>
+          <w:sz w:val="20"/>
+          <w:szCs w:val="20"/>
+        </w:rPr>
+        <w:t xml:space="preserve">[Corrigé le 21/09/2026 : la note ne disait pas d'où venait le constat ; les pages de liste de la HAS sont des façades JavaScript, le flux RSS se lit en headless.]</w:t>
       </w:r>
     </w:p>
     <w:p>
@@ -317,7 +349,7 @@
           <w:sz w:val="22"/>
           <w:szCs w:val="22"/>
         </w:rPr>
-        <w:t xml:space="preserve">• « Vie quotidienne des enfants de 3 à 11 ans accueillis dans les établissements de protection de l'enfance » — Appel à candidatures clos le 4/09/2026. Calendrier selon la (</w:t>
+        <w:t xml:space="preserve">• « Vie quotidienne des enfants de 3 à 11 ans accueillis dans les établissements de protection de l'enfance » — Appel à candidatures clos le 4/09/2026 (d'après l'édition du 02/09/2026 de cette veille, page alors ouverte ; page derrière une identification depuis le 14/09/2026). Calendrier selon la (</w:t>
       </w:r>
       <w:hyperlink w:history="1" r:id="rId4jjcpg-yit1pksoavihko">
         <w:r>
@@ -340,35 +372,68 @@
         </w:rPr>
         <w:t xml:space="preserve">) : composition des groupes 09-10/2026 (en cours), travaux 11/2026-10/2027, relecture 07-09/2027, passage en commission 4e trimestre 2027.</w:t>
       </w:r>
-    </w:p>
-    <w:p>
-      <w:pPr>
-        <w:spacing w:after="80"/>
-        <w:ind w:left="360"/>
-      </w:pPr>
-      <w:r>
-        <w:rPr>
-          <w:rFonts w:ascii="Calibri" w:cs="Calibri" w:eastAsia="Calibri" w:hAnsi="Calibri"/>
-          <w:color w:val="1F2937"/>
-          <w:sz w:val="22"/>
-          <w:szCs w:val="22"/>
-        </w:rPr>
-        <w:t xml:space="preserve">• « Accompagner dans et vers l'habitat — Volet 3 » — Appel à candidatures clos le 3/04/2026. Groupe de travail en cours. ⛔ Page de l'appel inaccessible (authentification requise au 21/09/2026). Aucune date de publication précisée.</w:t>
-      </w:r>
-    </w:p>
-    <w:p>
-      <w:pPr>
-        <w:spacing w:after="80"/>
-        <w:ind w:left="360"/>
-      </w:pPr>
-      <w:r>
-        <w:rPr>
-          <w:rFonts w:ascii="Calibri" w:cs="Calibri" w:eastAsia="Calibri" w:hAnsi="Calibri"/>
-          <w:color w:val="1F2937"/>
-          <w:sz w:val="22"/>
-          <w:szCs w:val="22"/>
-        </w:rPr>
-        <w:t xml:space="preserve">• « Prévention spécialisée : accompagner les jeunes sur leurs territoires et dans leurs milieux de vie » — 8 séances de groupe de travail prévues de juin 2025 à septembre 2026. ⛔ Page HAS inaccessible au 21/09/2026. Fin probable du cycle de travaux ce mois-ci ; publication à venir dans les prochains trimestres.</w:t>
+      <w:r>
+        <w:rPr>
+          <w:rFonts w:ascii="Calibri" w:cs="Calibri" w:eastAsia="Calibri" w:hAnsi="Calibri"/>
+          <w:i/>
+          <w:iCs/>
+          <w:color w:val="6B7280"/>
+          <w:sz w:val="20"/>
+          <w:szCs w:val="20"/>
+        </w:rPr>
+        <w:t xml:space="preserve"> [Corrigé le 21/09/2026 : la date était juste et venait de l'édition du 02/09/2026, sans le dire.]</w:t>
+      </w:r>
+    </w:p>
+    <w:p>
+      <w:pPr>
+        <w:spacing w:after="80"/>
+        <w:ind w:left="360"/>
+      </w:pPr>
+      <w:r>
+        <w:rPr>
+          <w:rFonts w:ascii="Calibri" w:cs="Calibri" w:eastAsia="Calibri" w:hAnsi="Calibri"/>
+          <w:color w:val="1F2937"/>
+          <w:sz w:val="22"/>
+          <w:szCs w:val="22"/>
+        </w:rPr>
+        <w:t xml:space="preserve">• « Accompagner dans et vers l'habitat — Volet 3 » — Appel à candidatures clos le 3/04/2026 (d'après l'édition du 02/09/2026 de cette veille, page alors ouverte). Groupe de travail en cours. ⛔ Page de l'appel inaccessible (authentification requise au 21/09/2026). Aucune date de publication précisée.</w:t>
+      </w:r>
+      <w:r>
+        <w:rPr>
+          <w:rFonts w:ascii="Calibri" w:cs="Calibri" w:eastAsia="Calibri" w:hAnsi="Calibri"/>
+          <w:i/>
+          <w:iCs/>
+          <w:color w:val="6B7280"/>
+          <w:sz w:val="20"/>
+          <w:szCs w:val="20"/>
+        </w:rPr>
+        <w:t xml:space="preserve"> [Corrigé le 21/09/2026 : provenance de la date ajoutée.]</w:t>
+      </w:r>
+    </w:p>
+    <w:p>
+      <w:pPr>
+        <w:spacing w:after="80"/>
+        <w:ind w:left="360"/>
+      </w:pPr>
+      <w:r>
+        <w:rPr>
+          <w:rFonts w:ascii="Calibri" w:cs="Calibri" w:eastAsia="Calibri" w:hAnsi="Calibri"/>
+          <w:color w:val="1F2937"/>
+          <w:sz w:val="22"/>
+          <w:szCs w:val="22"/>
+        </w:rPr>
+        <w:t xml:space="preserve">• « Prévention spécialisée : accompagner les jeunes sur leurs territoires et dans leurs milieux de vie » — 8 séances de groupe de travail prévues de juin 2025 à septembre 2026 (d'après l'édition du 02/09/2026 de cette veille, page alors ouverte). ⛔ Page HAS inaccessible au 21/09/2026. Aucune date de publication connue : aucune page ouverte ne la donne. </w:t>
+      </w:r>
+      <w:r>
+        <w:rPr>
+          <w:rFonts w:ascii="Calibri" w:cs="Calibri" w:eastAsia="Calibri" w:hAnsi="Calibri"/>
+          <w:i/>
+          <w:iCs/>
+          <w:color w:val="6B7280"/>
+          <w:sz w:val="20"/>
+          <w:szCs w:val="20"/>
+        </w:rPr>
+        <w:t xml:space="preserve">[Corrigé le 21/09/2026 : « Fin probable du cycle de travaux ce mois-ci ; publication à venir dans les prochains trimestres » était une projection sans source, sous une page ⛔ — le « délai habituel » du 14/09/2026 en plus prudent.]</w:t>
       </w:r>
     </w:p>
     <w:p>
@@ -496,22 +561,33 @@
           <w:sz w:val="22"/>
           <w:szCs w:val="22"/>
         </w:rPr>
-        <w:t xml:space="preserve">• RBPP « Prévention spécialisée » — Fin probable du groupe de travail en septembre 2026. Vise les équipes de prévention spécialisée en milieu ouvert (pas directement les ESSMS résidentiels), mais apports transférables sur la coordination territoriale.</w:t>
-      </w:r>
-    </w:p>
-    <w:p>
-      <w:pPr>
-        <w:spacing w:after="80"/>
-        <w:ind w:left="360"/>
-      </w:pPr>
-      <w:r>
-        <w:rPr>
-          <w:rFonts w:ascii="Calibri" w:cs="Calibri" w:eastAsia="Calibri" w:hAnsi="Calibri"/>
-          <w:color w:val="1F2937"/>
-          <w:sz w:val="22"/>
-          <w:szCs w:val="22"/>
-        </w:rPr>
-        <w:t xml:space="preserve">• RBPP « Vie quotidienne enfants 3-11 ans PE » — Phase constitution des groupes en cours (09-10/2026). Impact opérationnel sur les établissements de protection de l'enfance (MECS, foyers) à horizon fin 2027. Pas d'impact direct sur les foyers d'hébergement pour adultes en situation de handicap.</w:t>
+        <w:t xml:space="preserve">• RBPP « Prévention spécialisée » — Dernière séance du groupe de travail prévue en septembre 2026 (calendrier de l'édition du 02/09/2026) ; date de publication inconnue. Vise les équipes de prévention spécialisée en milieu ouvert (pas directement les ESSMS résidentiels), mais apports transférables sur la coordination territoriale.</w:t>
+      </w:r>
+    </w:p>
+    <w:p>
+      <w:pPr>
+        <w:spacing w:after="80"/>
+        <w:ind w:left="360"/>
+      </w:pPr>
+      <w:r>
+        <w:rPr>
+          <w:rFonts w:ascii="Calibri" w:cs="Calibri" w:eastAsia="Calibri" w:hAnsi="Calibri"/>
+          <w:color w:val="1F2937"/>
+          <w:sz w:val="22"/>
+          <w:szCs w:val="22"/>
+        </w:rPr>
+        <w:t xml:space="preserve">• RBPP vie quotidienne des enfants de 3 à 11 ans en protection de l'enfance — Phase constitution des groupes en cours (09-10/2026). Impact opérationnel sur les établissements de protection de l'enfance (MECS, foyers) à horizon fin 2027. Pas d'impact direct sur les foyers d'hébergement pour adultes en situation de handicap.</w:t>
+      </w:r>
+      <w:r>
+        <w:rPr>
+          <w:rFonts w:ascii="Calibri" w:cs="Calibri" w:eastAsia="Calibri" w:hAnsi="Calibri"/>
+          <w:i/>
+          <w:iCs/>
+          <w:color w:val="6B7280"/>
+          <w:sz w:val="20"/>
+          <w:szCs w:val="20"/>
+        </w:rPr>
+        <w:t xml:space="preserve"> [Corrigé le 21/09/2026 : titre résumé entre guillemets, qu'aucune page ne porte ; guillemets retirés.]</w:t>
       </w:r>
     </w:p>
     <w:p>
@@ -600,52 +676,220 @@
           <w:sz w:val="22"/>
           <w:szCs w:val="22"/>
         </w:rPr>
-        <w:t xml:space="preserve">Dernières RBPP publiées (antérieures à la fenêtre de veille) :</w:t>
-      </w:r>
-    </w:p>
-    <w:p>
-      <w:pPr>
-        <w:spacing w:after="80"/>
-        <w:ind w:left="360"/>
-      </w:pPr>
-      <w:r>
-        <w:rPr>
-          <w:rFonts w:ascii="Calibri" w:cs="Calibri" w:eastAsia="Calibri" w:hAnsi="Calibri"/>
-          <w:color w:val="1F2937"/>
-          <w:sz w:val="22"/>
-          <w:szCs w:val="22"/>
-        </w:rPr>
-        <w:t xml:space="preserve">• 09/07/2026 — Note de cadrage RBPP « Vie quotidienne des enfants de 3 à 11 ans en établissements de protection de l'enfance » (travaux, pas de RBPP publiée)</w:t>
-      </w:r>
-    </w:p>
-    <w:p>
-      <w:pPr>
-        <w:spacing w:after="80"/>
-        <w:ind w:left="360"/>
-      </w:pPr>
-      <w:r>
-        <w:rPr>
-          <w:rFonts w:ascii="Calibri" w:cs="Calibri" w:eastAsia="Calibri" w:hAnsi="Calibri"/>
-          <w:color w:val="1F2937"/>
-          <w:sz w:val="22"/>
-          <w:szCs w:val="22"/>
-        </w:rPr>
-        <w:t xml:space="preserve">• 27/06/2026 — RBPP sur le plan personnalisé d'accompagnement et le DUI (PPA-DUI)</w:t>
-      </w:r>
-    </w:p>
-    <w:p>
-      <w:pPr>
-        <w:spacing w:after="80"/>
-        <w:ind w:left="360"/>
-      </w:pPr>
-      <w:r>
-        <w:rPr>
-          <w:rFonts w:ascii="Calibri" w:cs="Calibri" w:eastAsia="Calibri" w:hAnsi="Calibri"/>
-          <w:color w:val="1F2937"/>
-          <w:sz w:val="22"/>
-          <w:szCs w:val="22"/>
-        </w:rPr>
-        <w:t xml:space="preserve">• 22/06/2026 — RBPP Vie intime, affective et sexuelle – volet 1 (mise à jour)</w:t>
+        <w:t xml:space="preserve">Dernières publications HAS pour le secteur social et médico-social, antérieures à la fenêtre (dates du site HAS, pages ouvertes le 21/09/2026) : </w:t>
+      </w:r>
+      <w:r>
+        <w:rPr>
+          <w:rFonts w:ascii="Calibri" w:cs="Calibri" w:eastAsia="Calibri" w:hAnsi="Calibri"/>
+          <w:i/>
+          <w:iCs/>
+          <w:color w:val="6B7280"/>
+          <w:sz w:val="20"/>
+          <w:szCs w:val="20"/>
+        </w:rPr>
+        <w:t xml:space="preserve">[Corrigé le 21/09/2026 : le bloc « Dernières RBPP publiées » venait de l'édition du 02/09/2026 avec deux dates de fichiers du dépôt — voir ci-dessous.]</w:t>
+      </w:r>
+    </w:p>
+    <w:p>
+      <w:pPr>
+        <w:spacing w:after="80"/>
+        <w:ind w:left="360"/>
+      </w:pPr>
+      <w:r>
+        <w:rPr>
+          <w:rFonts w:ascii="Calibri" w:cs="Calibri" w:eastAsia="Calibri" w:hAnsi="Calibri"/>
+          <w:color w:val="1F2937"/>
+          <w:sz w:val="22"/>
+          <w:szCs w:val="22"/>
+        </w:rPr>
+        <w:t xml:space="preserve">• 31/07/2026 — Feuille de route « Méthodes de mesure d'impact et d'évaluation économique des interventions sociales et médico-sociales : état des connaissances et perspectives » (</w:t>
+      </w:r>
+      <w:hyperlink w:history="1" r:id="rIdC21imp">
+        <w:r>
+          <w:rPr>
+            <w:rFonts w:ascii="Calibri" w:cs="Calibri" w:eastAsia="Calibri" w:hAnsi="Calibri"/>
+            <w:color w:val="1155CC"/>
+            <w:sz w:val="22"/>
+            <w:szCs w:val="22"/>
+            <w:u w:val="single"/>
+          </w:rPr>
+          <w:t xml:space="preserve">has-sante.fr/jcms/p_4264251</w:t>
+        </w:r>
+      </w:hyperlink>
+      <w:r>
+        <w:rPr>
+          <w:rFonts w:ascii="Calibri" w:cs="Calibri" w:eastAsia="Calibri" w:hAnsi="Calibri"/>
+          <w:color w:val="1F2937"/>
+          <w:sz w:val="22"/>
+          <w:szCs w:val="22"/>
+        </w:rPr>
+        <w:t xml:space="preserve">) — mis en ligne le 31 juil. 2026</w:t>
+      </w:r>
+    </w:p>
+    <w:p>
+      <w:pPr>
+        <w:spacing w:after="80"/>
+        <w:ind w:left="360"/>
+      </w:pPr>
+      <w:r>
+        <w:rPr>
+          <w:rFonts w:ascii="Calibri" w:cs="Calibri" w:eastAsia="Calibri" w:hAnsi="Calibri"/>
+          <w:color w:val="1F2937"/>
+          <w:sz w:val="22"/>
+          <w:szCs w:val="22"/>
+        </w:rPr>
+        <w:t xml:space="preserve">• 29/07/2026 — Guide méthodologique « Recueillir et prendre en compte le point de vue des enfants de la naissance à 6 ans » (</w:t>
+      </w:r>
+      <w:hyperlink w:history="1" r:id="rIdC21enf">
+        <w:r>
+          <w:rPr>
+            <w:rFonts w:ascii="Calibri" w:cs="Calibri" w:eastAsia="Calibri" w:hAnsi="Calibri"/>
+            <w:color w:val="1155CC"/>
+            <w:sz w:val="22"/>
+            <w:szCs w:val="22"/>
+            <w:u w:val="single"/>
+          </w:rPr>
+          <w:t xml:space="preserve">has-sante.fr/jcms/p_4255465</w:t>
+        </w:r>
+      </w:hyperlink>
+      <w:r>
+        <w:rPr>
+          <w:rFonts w:ascii="Calibri" w:cs="Calibri" w:eastAsia="Calibri" w:hAnsi="Calibri"/>
+          <w:color w:val="1F2937"/>
+          <w:sz w:val="22"/>
+          <w:szCs w:val="22"/>
+        </w:rPr>
+        <w:t xml:space="preserve">) — validé en juillet 2026, mis en ligne le 29 juil. 2026</w:t>
+      </w:r>
+    </w:p>
+    <w:p>
+      <w:pPr>
+        <w:spacing w:after="80"/>
+        <w:ind w:left="360"/>
+      </w:pPr>
+      <w:r>
+        <w:rPr>
+          <w:rFonts w:ascii="Calibri" w:cs="Calibri" w:eastAsia="Calibri" w:hAnsi="Calibri"/>
+          <w:color w:val="1F2937"/>
+          <w:sz w:val="22"/>
+          <w:szCs w:val="22"/>
+        </w:rPr>
+        <w:t xml:space="preserve">• 09/07/2026 — Note de cadrage RBPP « La vie quotidienne des enfants de 3 à 11 ans accueillis dans les établissements de protection de l'enfance » (travaux, pas de RBPP publiée) (</w:t>
+      </w:r>
+      <w:hyperlink w:history="1" r:id="rIdC21cad">
+        <w:r>
+          <w:rPr>
+            <w:rFonts w:ascii="Calibri" w:cs="Calibri" w:eastAsia="Calibri" w:hAnsi="Calibri"/>
+            <w:color w:val="1155CC"/>
+            <w:sz w:val="22"/>
+            <w:szCs w:val="22"/>
+            <w:u w:val="single"/>
+          </w:rPr>
+          <w:t xml:space="preserve">has-sante.fr/jcms/p_4159155</w:t>
+        </w:r>
+      </w:hyperlink>
+      <w:r>
+        <w:rPr>
+          <w:rFonts w:ascii="Calibri" w:cs="Calibri" w:eastAsia="Calibri" w:hAnsi="Calibri"/>
+          <w:color w:val="1F2937"/>
+          <w:sz w:val="22"/>
+          <w:szCs w:val="22"/>
+        </w:rPr>
+        <w:t xml:space="preserve">) — validée le 07 juillet 2026, mise en ligne le 09 juil. 2026</w:t>
+      </w:r>
+    </w:p>
+    <w:p>
+      <w:pPr>
+        <w:spacing w:after="80"/>
+        <w:ind w:left="360"/>
+      </w:pPr>
+      <w:r>
+        <w:rPr>
+          <w:rFonts w:ascii="Calibri" w:cs="Calibri" w:eastAsia="Calibri" w:hAnsi="Calibri"/>
+          <w:color w:val="1F2937"/>
+          <w:sz w:val="22"/>
+          <w:szCs w:val="22"/>
+        </w:rPr>
+        <w:t xml:space="preserve">• 24/06/2026 — Guide « Élaborer le Projet Personnalisé d'Accompagnement (PPA) dans le Dossier Usager Informatisé (DUI) » (</w:t>
+      </w:r>
+      <w:hyperlink w:history="1" r:id="rIdC21ppa">
+        <w:r>
+          <w:rPr>
+            <w:rFonts w:ascii="Calibri" w:cs="Calibri" w:eastAsia="Calibri" w:hAnsi="Calibri"/>
+            <w:color w:val="1155CC"/>
+            <w:sz w:val="22"/>
+            <w:szCs w:val="22"/>
+            <w:u w:val="single"/>
+          </w:rPr>
+          <w:t xml:space="preserve">has-sante.fr/jcms/p_3604128</w:t>
+        </w:r>
+      </w:hyperlink>
+      <w:r>
+        <w:rPr>
+          <w:rFonts w:ascii="Calibri" w:cs="Calibri" w:eastAsia="Calibri" w:hAnsi="Calibri"/>
+          <w:color w:val="1F2937"/>
+          <w:sz w:val="22"/>
+          <w:szCs w:val="22"/>
+        </w:rPr>
+        <w:t xml:space="preserve">) — validé le 12 mai 2026, mis en ligne le 24 juin 2026. </w:t>
+      </w:r>
+      <w:r>
+        <w:rPr>
+          <w:rFonts w:ascii="Calibri" w:cs="Calibri" w:eastAsia="Calibri" w:hAnsi="Calibri"/>
+          <w:i/>
+          <w:iCs/>
+          <w:color w:val="6B7280"/>
+          <w:sz w:val="20"/>
+          <w:szCs w:val="20"/>
+        </w:rPr>
+        <w:t xml:space="preserve">[Corrigé le 21/09/2026 : la note écrivait « 27/06/2026 — RBPP … PPA-DUI » : le 27/06 est la date du fichier de veille du dépôt, pas celle de la HAS.]</w:t>
+      </w:r>
+    </w:p>
+    <w:p>
+      <w:pPr>
+        <w:spacing w:after="80"/>
+        <w:ind w:left="360"/>
+      </w:pPr>
+      <w:r>
+        <w:rPr>
+          <w:rFonts w:ascii="Calibri" w:cs="Calibri" w:eastAsia="Calibri" w:hAnsi="Calibri"/>
+          <w:color w:val="1F2937"/>
+          <w:sz w:val="22"/>
+          <w:szCs w:val="22"/>
+        </w:rPr>
+        <w:t xml:space="preserve">• Pour mémoire, la RBPP « Accompagner la vie intime, affective et sexuelle des personnes en ESSMS (volet 1 - socle transversal) » (</w:t>
+      </w:r>
+      <w:hyperlink w:history="1" r:id="rIdC21vias">
+        <w:r>
+          <w:rPr>
+            <w:rFonts w:ascii="Calibri" w:cs="Calibri" w:eastAsia="Calibri" w:hAnsi="Calibri"/>
+            <w:color w:val="1155CC"/>
+            <w:sz w:val="22"/>
+            <w:szCs w:val="22"/>
+            <w:u w:val="single"/>
+          </w:rPr>
+          <w:t xml:space="preserve">has-sante.fr/jcms/p_3590098</w:t>
+        </w:r>
+      </w:hyperlink>
+      <w:r>
+        <w:rPr>
+          <w:rFonts w:ascii="Calibri" w:cs="Calibri" w:eastAsia="Calibri" w:hAnsi="Calibri"/>
+          <w:color w:val="1F2937"/>
+          <w:sz w:val="22"/>
+          <w:szCs w:val="22"/>
+        </w:rPr>
+        <w:t xml:space="preserve">) est validée le 14 janvier 2025, mise en ligne le 12 févr. 2025, et sa page porte « Mise à jour 14/11/2025 » (loi n° 2025-1057 du 6 novembre 2025). </w:t>
+      </w:r>
+      <w:r>
+        <w:rPr>
+          <w:rFonts w:ascii="Calibri" w:cs="Calibri" w:eastAsia="Calibri" w:hAnsi="Calibri"/>
+          <w:i/>
+          <w:iCs/>
+          <w:color w:val="6B7280"/>
+          <w:sz w:val="20"/>
+          <w:szCs w:val="20"/>
+        </w:rPr>
+        <w:t xml:space="preserve">[Corrigé le 21/09/2026 : la note écrivait « 22/06/2026 — RBPP Vie intime … volet 1 (mise à jour) » : aucune mise à jour du 22/06/2026 n'existe sur la page, c'est la date du fichier du dépôt — erreur déjà relevée par la fiche du 02/09/2026 et transmise par la note du 02/09/2026, relue comme source.]</w:t>
       </w:r>
     </w:p>
     <w:p>
@@ -683,7 +927,7 @@
           <w:sz w:val="22"/>
           <w:szCs w:val="22"/>
         </w:rPr>
-        <w:t xml:space="preserve">6 ✅ reprises dans le corps | 0 consultée sans apport | 2 ⛔ inaccessibles — 8 sources documentaires tentées</w:t>
+        <w:t xml:space="preserve">11 ✅ reprises dans le corps | 0 consultée sans apport | 2 ⛔ inaccessibles — 13 sources documentaires tentées</w:t>
       </w:r>
     </w:p>
     <w:p>
@@ -842,7 +1086,7 @@
           <w:sz w:val="22"/>
           <w:szCs w:val="22"/>
         </w:rPr>
-        <w:t xml:space="preserve">✅ HAS, Consultation ciblée usagers « Guide actes esthétiques hors chirurgicaux » (mise en ligne 8 sept. 2026, clôture 30 sept. 2026) (</w:t>
+        <w:t xml:space="preserve">✅ HAS, Consultation ciblée d'usagers pour un guide méthodologique sur les actes à visée esthétique hors actes chirurgicaux (mise en ligne 8 sept. 2026, clôture 30 sept. 2026) (</w:t>
       </w:r>
       <w:hyperlink w:history="1" r:id="rIdlfbwvw-8kmf821tm0ccg-">
         <w:r>
@@ -914,6 +1158,186 @@
           <w:sz w:val="22"/>
           <w:szCs w:val="22"/>
         </w:rPr>
+        <w:t xml:space="preserve">✅ HAS, flux RSS « Recommandations et guides » — lu le 21 septembre 2026 (</w:t>
+      </w:r>
+      <w:hyperlink w:history="1" r:id="rIdC21rss">
+        <w:r>
+          <w:rPr>
+            <w:rFonts w:ascii="Calibri" w:cs="Calibri" w:eastAsia="Calibri" w:hAnsi="Calibri"/>
+            <w:color w:val="1155CC"/>
+            <w:sz w:val="22"/>
+            <w:szCs w:val="22"/>
+            <w:u w:val="single"/>
+          </w:rPr>
+          <w:t xml:space="preserve">has-sante.fr/feed/Rss2.jsp?id=p_3081452</w:t>
+        </w:r>
+      </w:hyperlink>
+      <w:r>
+        <w:rPr>
+          <w:rFonts w:ascii="Calibri" w:cs="Calibri" w:eastAsia="Calibri" w:hAnsi="Calibri"/>
+          <w:color w:val="1F2937"/>
+          <w:sz w:val="22"/>
+          <w:szCs w:val="22"/>
+        </w:rPr>
+        <w:t xml:space="preserve">) — HTTP 200 vérifié [ajouté le 21/09/2026 à la relecture]</w:t>
+      </w:r>
+    </w:p>
+    <w:p>
+      <w:pPr>
+        <w:spacing w:after="80"/>
+        <w:ind w:left="360"/>
+      </w:pPr>
+      <w:r>
+        <w:rPr>
+          <w:rFonts w:ascii="Calibri" w:cs="Calibri" w:eastAsia="Calibri" w:hAnsi="Calibri"/>
+          <w:color w:val="1F2937"/>
+          <w:sz w:val="22"/>
+          <w:szCs w:val="22"/>
+        </w:rPr>
+        <w:t xml:space="preserve">✅ HAS, Guide « Élaborer le Projet Personnalisé d'Accompagnement (PPA) dans le Dossier Usager Informatisé (DUI) », validé le 12 mai 2026, mis en ligne le 24 juin 2026 (</w:t>
+      </w:r>
+      <w:hyperlink w:history="1" r:id="rIdC21ppa">
+        <w:r>
+          <w:rPr>
+            <w:rFonts w:ascii="Calibri" w:cs="Calibri" w:eastAsia="Calibri" w:hAnsi="Calibri"/>
+            <w:color w:val="1155CC"/>
+            <w:sz w:val="22"/>
+            <w:szCs w:val="22"/>
+            <w:u w:val="single"/>
+          </w:rPr>
+          <w:t xml:space="preserve">has-sante.fr/jcms/p_3604128</w:t>
+        </w:r>
+      </w:hyperlink>
+      <w:r>
+        <w:rPr>
+          <w:rFonts w:ascii="Calibri" w:cs="Calibri" w:eastAsia="Calibri" w:hAnsi="Calibri"/>
+          <w:color w:val="1F2937"/>
+          <w:sz w:val="22"/>
+          <w:szCs w:val="22"/>
+        </w:rPr>
+        <w:t xml:space="preserve">) — ouvert le 21 septembre 2026, HTTP 200 vérifié [ajouté à la relecture]</w:t>
+      </w:r>
+    </w:p>
+    <w:p>
+      <w:pPr>
+        <w:spacing w:after="80"/>
+        <w:ind w:left="360"/>
+      </w:pPr>
+      <w:r>
+        <w:rPr>
+          <w:rFonts w:ascii="Calibri" w:cs="Calibri" w:eastAsia="Calibri" w:hAnsi="Calibri"/>
+          <w:color w:val="1F2937"/>
+          <w:sz w:val="22"/>
+          <w:szCs w:val="22"/>
+        </w:rPr>
+        <w:t xml:space="preserve">✅ HAS, RBPP « Accompagner la vie intime, affective et sexuelle des personnes en ESSMS (volet 1 - socle transversal) », mise en ligne le 12 févr. 2025, mise à jour 14/11/2025 (</w:t>
+      </w:r>
+      <w:hyperlink w:history="1" r:id="rIdC21vias">
+        <w:r>
+          <w:rPr>
+            <w:rFonts w:ascii="Calibri" w:cs="Calibri" w:eastAsia="Calibri" w:hAnsi="Calibri"/>
+            <w:color w:val="1155CC"/>
+            <w:sz w:val="22"/>
+            <w:szCs w:val="22"/>
+            <w:u w:val="single"/>
+          </w:rPr>
+          <w:t xml:space="preserve">has-sante.fr/jcms/p_3590098</w:t>
+        </w:r>
+      </w:hyperlink>
+      <w:r>
+        <w:rPr>
+          <w:rFonts w:ascii="Calibri" w:cs="Calibri" w:eastAsia="Calibri" w:hAnsi="Calibri"/>
+          <w:color w:val="1F2937"/>
+          <w:sz w:val="22"/>
+          <w:szCs w:val="22"/>
+        </w:rPr>
+        <w:t xml:space="preserve">) — ouvert le 21 septembre 2026, HTTP 200 vérifié [ajouté à la relecture]</w:t>
+      </w:r>
+    </w:p>
+    <w:p>
+      <w:pPr>
+        <w:spacing w:after="80"/>
+        <w:ind w:left="360"/>
+      </w:pPr>
+      <w:r>
+        <w:rPr>
+          <w:rFonts w:ascii="Calibri" w:cs="Calibri" w:eastAsia="Calibri" w:hAnsi="Calibri"/>
+          <w:color w:val="1F2937"/>
+          <w:sz w:val="22"/>
+          <w:szCs w:val="22"/>
+        </w:rPr>
+        <w:t xml:space="preserve">✅ HAS, Guide méthodologique « Recueillir et prendre en compte le point de vue des enfants de la naissance à 6 ans », mis en ligne le 29 juil. 2026 (</w:t>
+      </w:r>
+      <w:hyperlink w:history="1" r:id="rIdC21enf">
+        <w:r>
+          <w:rPr>
+            <w:rFonts w:ascii="Calibri" w:cs="Calibri" w:eastAsia="Calibri" w:hAnsi="Calibri"/>
+            <w:color w:val="1155CC"/>
+            <w:sz w:val="22"/>
+            <w:szCs w:val="22"/>
+            <w:u w:val="single"/>
+          </w:rPr>
+          <w:t xml:space="preserve">has-sante.fr/jcms/p_4255465</w:t>
+        </w:r>
+      </w:hyperlink>
+      <w:r>
+        <w:rPr>
+          <w:rFonts w:ascii="Calibri" w:cs="Calibri" w:eastAsia="Calibri" w:hAnsi="Calibri"/>
+          <w:color w:val="1F2937"/>
+          <w:sz w:val="22"/>
+          <w:szCs w:val="22"/>
+        </w:rPr>
+        <w:t xml:space="preserve">) — ouvert le 21 septembre 2026, HTTP 200 vérifié [ajouté à la relecture]</w:t>
+      </w:r>
+    </w:p>
+    <w:p>
+      <w:pPr>
+        <w:spacing w:after="80"/>
+        <w:ind w:left="360"/>
+      </w:pPr>
+      <w:r>
+        <w:rPr>
+          <w:rFonts w:ascii="Calibri" w:cs="Calibri" w:eastAsia="Calibri" w:hAnsi="Calibri"/>
+          <w:color w:val="1F2937"/>
+          <w:sz w:val="22"/>
+          <w:szCs w:val="22"/>
+        </w:rPr>
+        <w:t xml:space="preserve">✅ HAS, Feuille de route « Méthodes de mesure d'impact et d'évaluation économique des interventions sociales et médico-sociales : état des connaissances et perspectives », mis en ligne le 31 juil. 2026 (</w:t>
+      </w:r>
+      <w:hyperlink w:history="1" r:id="rIdC21imp">
+        <w:r>
+          <w:rPr>
+            <w:rFonts w:ascii="Calibri" w:cs="Calibri" w:eastAsia="Calibri" w:hAnsi="Calibri"/>
+            <w:color w:val="1155CC"/>
+            <w:sz w:val="22"/>
+            <w:szCs w:val="22"/>
+            <w:u w:val="single"/>
+          </w:rPr>
+          <w:t xml:space="preserve">has-sante.fr/jcms/p_4264251</w:t>
+        </w:r>
+      </w:hyperlink>
+      <w:r>
+        <w:rPr>
+          <w:rFonts w:ascii="Calibri" w:cs="Calibri" w:eastAsia="Calibri" w:hAnsi="Calibri"/>
+          <w:color w:val="1F2937"/>
+          <w:sz w:val="22"/>
+          <w:szCs w:val="22"/>
+        </w:rPr>
+        <w:t xml:space="preserve">) — ouvert le 21 septembre 2026, HTTP 200 vérifié [ajouté à la relecture]</w:t>
+      </w:r>
+    </w:p>
+    <w:p>
+      <w:pPr>
+        <w:spacing w:after="80"/>
+        <w:ind w:left="360"/>
+      </w:pPr>
+      <w:r>
+        <w:rPr>
+          <w:rFonts w:ascii="Calibri" w:cs="Calibri" w:eastAsia="Calibri" w:hAnsi="Calibri"/>
+          <w:color w:val="1F2937"/>
+          <w:sz w:val="22"/>
+          <w:szCs w:val="22"/>
+        </w:rPr>
         <w:t xml:space="preserve">⛔ HAS, RBPP « Prévention spécialisée » — groupe de travail juin 2025-sept. 2026 — page inaccessible au 21 sept. 2026 (authentification requise)</w:t>
       </w:r>
     </w:p>
@@ -966,6 +1390,175 @@
           <w:szCs w:val="22"/>
         </w:rPr>
         <w:t xml:space="preserve">Note produite automatiquement — Job rbpp-pipeline — 21 septembre 2026 | Pour usage interne ESSMS uniquement</w:t>
+      </w:r>
+    </w:p>
+    <w:p>
+      <w:pPr>
+        <w:pStyle w:val="Heading2"/>
+        <w:spacing w:after="100" w:before="280"/>
+      </w:pPr>
+      <w:r>
+        <w:rPr>
+          <w:rFonts w:ascii="Calibri" w:cs="Calibri" w:eastAsia="Calibri" w:hAnsi="Calibri"/>
+          <w:b/>
+          <w:bCs/>
+          <w:color w:val="1B3A6B"/>
+          <w:sz w:val="28"/>
+          <w:szCs w:val="28"/>
+        </w:rPr>
+        <w:t xml:space="preserve">📝 Journal des corrections (21/09/2026)</w:t>
+      </w:r>
+    </w:p>
+    <w:p>
+      <w:pPr>
+        <w:spacing w:after="80"/>
+      </w:pPr>
+      <w:r>
+        <w:rPr>
+          <w:rFonts w:ascii="Calibri" w:cs="Calibri" w:eastAsia="Calibri" w:hAnsi="Calibri"/>
+          <w:i/>
+          <w:iCs/>
+          <w:color w:val="6B7280"/>
+          <w:sz w:val="20"/>
+          <w:szCs w:val="20"/>
+        </w:rPr>
+        <w:t xml:space="preserve">Relecture du 21/09/2026 au soir, pages rouvertes avec un agent de navigateur, flux RSS de la HAS lu. Les corrections sont intégrées au texte, marquées [Corrigé le 21/09/2026 : …]. Formulations d'origine :</w:t>
+      </w:r>
+    </w:p>
+    <w:p>
+      <w:pPr>
+        <w:spacing w:after="80"/>
+        <w:ind w:left="360"/>
+      </w:pPr>
+      <w:r>
+        <w:rPr>
+          <w:rFonts w:ascii="Calibri" w:cs="Calibri" w:eastAsia="Calibri" w:hAnsi="Calibri"/>
+          <w:i/>
+          <w:iCs/>
+          <w:color w:val="6B7280"/>
+          <w:sz w:val="20"/>
+          <w:szCs w:val="20"/>
+        </w:rPr>
+        <w:t xml:space="preserve">• En bref : « Aucune nouvelle RBPP publiée … entre le 14 et le 21 septembre 2026 » — sans source ; le flux RSS de la HAS, lisible en headless, le confirme et est désormais lié.</w:t>
+      </w:r>
+    </w:p>
+    <w:p>
+      <w:pPr>
+        <w:spacing w:after="80"/>
+        <w:ind w:left="360"/>
+      </w:pPr>
+      <w:r>
+        <w:rPr>
+          <w:rFonts w:ascii="Calibri" w:cs="Calibri" w:eastAsia="Calibri" w:hAnsi="Calibri"/>
+          <w:i/>
+          <w:iCs/>
+          <w:color w:val="6B7280"/>
+          <w:sz w:val="20"/>
+          <w:szCs w:val="20"/>
+        </w:rPr>
+        <w:t xml:space="preserve">• À venir, prévention spécialisée : « Fin probable du cycle de travaux ce mois-ci ; publication à venir dans les prochains trimestres » — projection sans source.</w:t>
+      </w:r>
+    </w:p>
+    <w:p>
+      <w:pPr>
+        <w:spacing w:after="80"/>
+        <w:ind w:left="360"/>
+      </w:pPr>
+      <w:r>
+        <w:rPr>
+          <w:rFonts w:ascii="Calibri" w:cs="Calibri" w:eastAsia="Calibri" w:hAnsi="Calibri"/>
+          <w:i/>
+          <w:iCs/>
+          <w:color w:val="6B7280"/>
+          <w:sz w:val="20"/>
+          <w:szCs w:val="20"/>
+        </w:rPr>
+        <w:t xml:space="preserve">• À venir : « Appel à candidatures clos le 4/09/2026 », « clos le 3/04/2026 », « 8 séances … juin 2025 à septembre 2026 » — dates justes, héritées de l'édition du 02/09/2026 sans le dire.</w:t>
+      </w:r>
+    </w:p>
+    <w:p>
+      <w:pPr>
+        <w:spacing w:after="80"/>
+        <w:ind w:left="360"/>
+      </w:pPr>
+      <w:r>
+        <w:rPr>
+          <w:rFonts w:ascii="Calibri" w:cs="Calibri" w:eastAsia="Calibri" w:hAnsi="Calibri"/>
+          <w:i/>
+          <w:iCs/>
+          <w:color w:val="6B7280"/>
+          <w:sz w:val="20"/>
+          <w:szCs w:val="20"/>
+        </w:rPr>
+        <w:t xml:space="preserve">• Impacts : « RBPP “Vie quotidienne enfants 3-11 ans PE” » — titre résumé entre guillemets.</w:t>
+      </w:r>
+    </w:p>
+    <w:p>
+      <w:pPr>
+        <w:spacing w:after="80"/>
+        <w:ind w:left="360"/>
+      </w:pPr>
+      <w:r>
+        <w:rPr>
+          <w:rFonts w:ascii="Calibri" w:cs="Calibri" w:eastAsia="Calibri" w:hAnsi="Calibri"/>
+          <w:i/>
+          <w:iCs/>
+          <w:color w:val="6B7280"/>
+          <w:sz w:val="20"/>
+          <w:szCs w:val="20"/>
+        </w:rPr>
+        <w:t xml:space="preserve">• Rappel : « 27/06/2026 — RBPP sur le plan personnalisé d'accompagnement et le DUI (PPA-DUI) » — la HAS : validé le 12 mai 2026, mis en ligne le 24 juin 2026 ; 27/06 est la date du fichier de veille.</w:t>
+      </w:r>
+    </w:p>
+    <w:p>
+      <w:pPr>
+        <w:spacing w:after="80"/>
+        <w:ind w:left="360"/>
+      </w:pPr>
+      <w:r>
+        <w:rPr>
+          <w:rFonts w:ascii="Calibri" w:cs="Calibri" w:eastAsia="Calibri" w:hAnsi="Calibri"/>
+          <w:i/>
+          <w:iCs/>
+          <w:color w:val="6B7280"/>
+          <w:sz w:val="20"/>
+          <w:szCs w:val="20"/>
+        </w:rPr>
+        <w:t xml:space="preserve">• Rappel : « 22/06/2026 — RBPP Vie intime, affective et sexuelle – volet 1 (mise à jour) » — la page HAS : mise en ligne le 12/02/2025, mise à jour 14/11/2025 ; 22/06/2026 est la date du fichier du dépôt.</w:t>
+      </w:r>
+    </w:p>
+    <w:p>
+      <w:pPr>
+        <w:spacing w:after="80"/>
+        <w:ind w:left="360"/>
+      </w:pPr>
+      <w:r>
+        <w:rPr>
+          <w:rFonts w:ascii="Calibri" w:cs="Calibri" w:eastAsia="Calibri" w:hAnsi="Calibri"/>
+          <w:i/>
+          <w:iCs/>
+          <w:color w:val="6B7280"/>
+          <w:sz w:val="20"/>
+          <w:szCs w:val="20"/>
+        </w:rPr>
+        <w:t xml:space="preserve">• Sources : « 6 ✅ reprises dans le corps | 0 consultée sans apport | 2 ⛔ inaccessibles — 8 sources documentaires tentées » — cinq pages ouvertes à la relecture ajoutées (flux RSS, PPA-DUI, vie intime volet 1, deux guides de juillet) : 11 | 0 | 2 — 13.</w:t>
+      </w:r>
+    </w:p>
+    <w:p>
+      <w:pPr>
+        <w:spacing w:after="80"/>
+        <w:ind w:left="360"/>
+      </w:pPr>
+      <w:r>
+        <w:rPr>
+          <w:rFonts w:ascii="Calibri" w:cs="Calibri" w:eastAsia="Calibri" w:hAnsi="Calibri"/>
+          <w:i/>
+          <w:iCs/>
+          <w:color w:val="6B7280"/>
+          <w:sz w:val="20"/>
+          <w:szCs w:val="20"/>
+        </w:rPr>
+        <w:t xml:space="preserve">• Sources : « Guide actes esthétiques hors chirurgicaux » — titre résumé entre guillemets.</w:t>
       </w:r>
     </w:p>
     <w:sectPr>

</xml_diff>